<commit_message>
Add initial version of R_Report document
</commit_message>
<xml_diff>
--- a/output/DDR_Report.docx
+++ b/output/DDR_Report.docx
@@ -397,6 +397,11 @@
         <w:t>Thermal Image — General</w:t>
       </w:r>
     </w:p>
+    <w:p>
+      <w:r>
+        <w:t>Inspection Images: Image Not Available</w:t>
+      </w:r>
+    </w:p>
     <w:p/>
     <w:p>
       <w:pPr>

</xml_diff>